<commit_message>
chore: bỏ thư mục docs khỏi repo trước khi công khai
Thư mục docs chứa tài liệu nội bộ của quá trình làm: kịch bản demo, lời dẫn quay
video, ghi chú bàn giao, danh sách việc còn làm, tài khoản demo kèm mật khẩu.
Không thứ nào trong đó là phần mềm, và không thứ nào cần cho người đọc mã.

Tệp vẫn nằm nguyên trên máy, chỉ thôi được theo dõi.

MỘT ĐIỀU PHẢI BIẾT: cách này KHÔNG xoá docs khỏi lịch sử. Ai clone repo rồi xem
các commit trước vẫn đọc được toàn bộ, kể cả bảng tài khoản demo. Nếu mục đích
là để người ngoài không đọc được thì phải viết lại lịch sử — việc đó đổi mọi mã
commit và cần cân nhắc riêng, không làm lẫn vào đây.

Đã quét trước khi công khai: không có khoá API, chứng chỉ riêng hay mật khẩu thật
nào lọt vào mã nguồn. Tệp .env không bị theo dõi, chỉ có .env.example.

Co-Authored-By: Claude Opus 5 (1M context) <noreply@anthropic.com>
</commit_message>
<xml_diff>
--- a/Toan-bo-chuc-nang-va-luong-nghiep-vu.docx
+++ b/Toan-bo-chuc-nang-va-luong-nghiep-vu.docx
@@ -9224,9 +9224,152 @@
         <w:t xml:space="preserve">Ai:</w:t>
       </w:r>
       <w:r>
-        <w:t xml:space="preserve"> ADMIN, WAREHOUSE (kho thôn báo cho thôn mình), RESCUE · 🖥️ *Điều phối cứu hộ* · 📱 tab *Báo cáo*</w:t>
+        <w:t xml:space="preserve"> ADMIN, WAREHOUSE (kho thôn báo cho thôn mình), RESCUE </w:t>
+      </w:r>
+      <w:r>
+        <w:rPr>
+          <w:b/>
+        </w:rPr>
+        <w:t xml:space="preserve">Ở đâu:</w:t>
+      </w:r>
+      <w:r>
+        <w:t xml:space="preserve"> 📱 tab *Báo cáo* — cho cả ba vai · 🖥️ *Điều phối cứu hộ* — </w:t>
+      </w:r>
+      <w:r>
+        <w:rPr>
+          <w:b/>
+        </w:rPr>
+        <w:t xml:space="preserve">chỉ ADMIN</w:t>
       </w:r>
     </w:p>
+    <w:tbl>
+      <w:tblPr>
+        <w:tblW w:w="9354" w:type="dxa"/>
+        <w:tblLayout w:type="fixed"/>
+      </w:tblPr>
+      <w:tblGrid>
+        <w:gridCol w:w="9354"/>
+      </w:tblGrid>
+      <w:tr>
+        <w:trPr>
+          <w:cantSplit/>
+        </w:trPr>
+        <w:tc>
+          <w:tcPr>
+            <w:tcW w:w="9354" w:type="dxa"/>
+            <w:shd w:val="clear" w:fill="FBF7E8"/>
+            <w:tcBorders>
+              <w:left w:val="single" w:sz="18" w:space="0" w:color="C99A2E"/>
+              <w:top w:val="single" w:sz="4" w:space="0" w:color="D8DDE2"/>
+              <w:bottom w:val="single" w:sz="4" w:space="0" w:color="D8DDE2"/>
+              <w:right w:val="single" w:sz="4" w:space="0" w:color="D8DDE2"/>
+            </w:tcBorders>
+            <w:tcMar>
+              <w:top w:w="90" w:type="dxa"/>
+              <w:left w:w="140" w:type="dxa"/>
+              <w:bottom w:w="90" w:type="dxa"/>
+              <w:right w:w="140" w:type="dxa"/>
+            </w:tcMar>
+          </w:tcPr>
+          <w:p>
+            <w:pPr>
+              <w:spacing w:before="0" w:after="0"/>
+              <w:jc w:val="both"/>
+            </w:pPr>
+            <w:r>
+              <w:rPr>
+                <w:sz w:val="22"/>
+                <w:szCs w:val="22"/>
+              </w:rPr>
+              <w:t xml:space="preserve">Trên web, tab *Điều phối cứu hộ* lọc theo quyền </w:t>
+            </w:r>
+            <w:r>
+              <w:rPr>
+                <w:rFonts w:ascii="Consolas" w:hAnsi="Consolas"/>
+                <w:color w:val="8A2A2A"/>
+                <w:sz w:val="19"/>
+                <w:szCs w:val="19"/>
+                <w:shd w:val="clear" w:fill="F0F2F4"/>
+              </w:rPr>
+              <w:t xml:space="preserve">mission:create</w:t>
+            </w:r>
+            <w:r>
+              <w:rPr>
+                <w:sz w:val="22"/>
+                <w:szCs w:val="22"/>
+              </w:rPr>
+              <w:t xml:space="preserve"> chứ không phải </w:t>
+            </w:r>
+            <w:r>
+              <w:rPr>
+                <w:rFonts w:ascii="Consolas" w:hAnsi="Consolas"/>
+                <w:color w:val="8A2A2A"/>
+                <w:sz w:val="19"/>
+                <w:szCs w:val="19"/>
+                <w:shd w:val="clear" w:fill="F0F2F4"/>
+              </w:rPr>
+              <w:t xml:space="preserve">mission:view</w:t>
+            </w:r>
+            <w:r>
+              <w:rPr>
+                <w:sz w:val="22"/>
+                <w:szCs w:val="22"/>
+              </w:rPr>
+              <w:t xml:space="preserve">. Trang đó chỉ chứa form khai tình huống, mà form ấy chỉ dựng cho người lập được phương án. Vai kho có </w:t>
+            </w:r>
+            <w:r>
+              <w:rPr>
+                <w:rFonts w:ascii="Consolas" w:hAnsi="Consolas"/>
+                <w:color w:val="8A2A2A"/>
+                <w:sz w:val="19"/>
+                <w:szCs w:val="19"/>
+                <w:shd w:val="clear" w:fill="F0F2F4"/>
+              </w:rPr>
+              <w:t xml:space="preserve">mission:view</w:t>
+            </w:r>
+            <w:r>
+              <w:rPr>
+                <w:sz w:val="22"/>
+                <w:szCs w:val="22"/>
+              </w:rPr>
+              <w:t xml:space="preserve"> nên trước đây vẫn thấy tab, bấm vào lại ra một trang trắng chỉ có tiêu đề — tệ hơn hẳn việc không có tab. Quyền gọi API </w:t>
+            </w:r>
+            <w:r>
+              <w:rPr>
+                <w:rFonts w:ascii="Consolas" w:hAnsi="Consolas"/>
+                <w:color w:val="8A2A2A"/>
+                <w:sz w:val="19"/>
+                <w:szCs w:val="19"/>
+                <w:shd w:val="clear" w:fill="F0F2F4"/>
+              </w:rPr>
+              <w:t xml:space="preserve">incident:report_submit</w:t>
+            </w:r>
+            <w:r>
+              <w:rPr>
+                <w:sz w:val="22"/>
+                <w:szCs w:val="22"/>
+              </w:rPr>
+              <w:t xml:space="preserve"> thì </w:t>
+            </w:r>
+            <w:r>
+              <w:rPr>
+                <w:b/>
+                <w:sz w:val="22"/>
+                <w:szCs w:val="22"/>
+              </w:rPr>
+              <w:t xml:space="preserve">cả ba vai vẫn có</w:t>
+            </w:r>
+            <w:r>
+              <w:rPr>
+                <w:sz w:val="22"/>
+                <w:szCs w:val="22"/>
+              </w:rPr>
+              <w:t xml:space="preserve">: kho thôn và lực lượng hiện trường báo tình huống từ điện thoại.</w:t>
+            </w:r>
+          </w:p>
+        </w:tc>
+      </w:tr>
+    </w:tbl>
     <w:p>
       <w:pPr>
         <w:spacing w:before="0" w:after="120"/>

</xml_diff>